<commit_message>
docs: asking in plain words, the switches, and the plan for searching inside documents
Decision document: §5's builder line says what was built on 26 September
and how each function and sensitivity is switched; new §7 sets out
passage search over articles, transcripts and narratives as four
choices with sizes (2 KB per passage at half precision; a million
passages about 4 GB on the VM), recommending embedding at ingest with a
disposable DuckDB copy on the VM, gated by the download rule, skipping
image-only files until OCR is decided. Runbook: platform egress for both
VMs, the project-key rule, the embeddings paragraph, `index --embed`,
and a table of the three steps and their switches. Env examples, README,
CLAUDE.md and the researcher guide (Markdown and Word) updated to match.

Co-Authored-By: Claude Fable 5.1 <noreply@anthropic.com>
Claude-Session: https://claude.ai/code/session_01BmKsmMD68V72AP5wG8is8r
</commit_message>
<xml_diff>
--- a/docs/how-to-deposit.docx
+++ b/docs/how-to-deposit.docx
@@ -428,7 +428,16 @@
         <w:t xml:space="preserve"> </w:t>
       </w:r>
       <w:r>
-        <w:t xml:space="preserve">in the top bar. Search by a word from the name or description, or filter by strand, subject or whether the data is green or amber. Open a dataset to read its description, see what it was made from and what has been made from it, and download any file. A large download that is interrupted can be resumed. Amber data is listed for everyone; whether you can download it depends on the Centre’s rule, and the page tells you who to ask.</w:t>
+        <w:t xml:space="preserve">in the top bar. Search by a word from the name or description, or filter by strand, subject or whether the data is green or amber. Where the Centre has switched it on, you can also type a question in your own words, such as</w:t>
+      </w:r>
+      <w:r>
+        <w:t xml:space="preserve"> </w:t>
+      </w:r>
+      <w:r>
+        <w:t xml:space="preserve">“anything on deaths in armed conflicts since 1990”</w:t>
+      </w:r>
+      <w:r>
+        <w:t xml:space="preserve">: the page shows how it understood you, fills in the filters to match, and puts the closest datasets first. Your question and the descriptions of likely matches are read by KCL’s own AI service; the files themselves never are. Open a dataset to read its description, see what it was made from and what has been made from it, and download any file. A large download that is interrupted can be resumed. Amber data is listed for everyone; whether you can download it depends on the Centre’s rule, and the page tells you who to ask.</w:t>
       </w:r>
     </w:p>
     <w:bookmarkEnd w:id="24"/>

</xml_diff>

<commit_message>
feat: say why a passage matched; "Search inside content"
Each passage shown on /search has its sentence closest to the question
marked: the sentences of the passages shown go to the embedding model
in one more call, and the best (plus one within a small margin, never
more than two) is wrapped in <mark>. The question's own words are bold
wherever they appear, matching on the first five letters so "verified"
finds "verification"; stop words are left alone. A one-sentence passage
is not sent and shows unmarked. If the extra call fails the passages
show plain with a notice. /search.json carries the sentences too.
Passage text is escaped before the marks go in. The navigation link
and page title are now "Search inside content".

Co-Authored-By: Claude Fable 5.1 <noreply@anthropic.com>
Claude-Session: https://claude.ai/code/session_01BmKsmMD68V72AP5wG8is8r
</commit_message>
<xml_diff>
--- a/docs/how-to-deposit.docx
+++ b/docs/how-to-deposit.docx
@@ -447,13 +447,13 @@
           <w:b/>
           <w:bCs/>
         </w:rPr>
-        <w:t xml:space="preserve">Search inside</w:t>
-      </w:r>
-      <w:r>
-        <w:t xml:space="preserve"> </w:t>
-      </w:r>
-      <w:r>
-        <w:t xml:space="preserve">appears in the top bar, you can also search what the documents themselves say: type a phrase or a question and you get the passages that come closest, each with its dataset, its file and, for PDFs, its page. You only ever see passages from files you would be allowed to download. Open a dataset to read its description, see what it was made from and what has been made from it, and download any file. A large download that is interrupted can be resumed. Amber data is listed for everyone; whether you can download it depends on the Centre’s rule, and the page tells you who to ask.</w:t>
+        <w:t xml:space="preserve">Search inside content</w:t>
+      </w:r>
+      <w:r>
+        <w:t xml:space="preserve"> </w:t>
+      </w:r>
+      <w:r>
+        <w:t xml:space="preserve">appears in the top bar, you can also search what the documents themselves say: type a phrase or a question and you get the passages that come closest, each with its dataset, its file and, for PDFs, its page, with the sentence nearest to your question marked and your own words in bold. You only ever see passages from files you would be allowed to download. Open a dataset to read its description, see what it was made from and what has been made from it, and download any file. A large download that is interrupted can be resumed. Amber data is listed for everyone; whether you can download it depends on the Centre’s rule, and the page tells you who to ask.</w:t>
       </w:r>
     </w:p>
     <w:bookmarkEnd w:id="24"/>

</xml_diff>

<commit_message>
docs: depositing to an existing dataset through the web
Researcher guide (and its Word copy), the runbook's read-role table,
CLAUDE.md's out-of-scope line, and a decision note.

Co-Authored-By: Claude Fable 5.1 <noreply@anthropic.com>
Claude-Session: https://claude.ai/code/session_016bYGaLrYcmFNF1cG73NxTr
</commit_message>
<xml_diff>
--- a/docs/how-to-deposit.docx
+++ b/docs/how-to-deposit.docx
@@ -157,7 +157,39 @@
         <w:t xml:space="preserve">Describe the dataset</w:t>
       </w:r>
       <w:r>
-        <w:t xml:space="preserve">. Each box has a note under it saying what goes there. The slip on the right shows where the files will land as you type.</w:t>
+        <w:t xml:space="preserve">. Each box has a note under it saying what goes there. The slip on the right shows where the files will land as you type. As you name the project and dataset, the form offers the names already in use, and a note under the dataset name tells you what will happen: if the dataset already exists, how many files it has and that yours will be added to it (press</w:t>
+      </w:r>
+      <w:r>
+        <w:t xml:space="preserve"> </w:t>
+      </w:r>
+      <w:r>
+        <w:rPr>
+          <w:b/>
+          <w:bCs/>
+        </w:rPr>
+        <w:t xml:space="preserve">Use its details</w:t>
+      </w:r>
+      <w:r>
+        <w:t xml:space="preserve"> </w:t>
+      </w:r>
+      <w:r>
+        <w:t xml:space="preserve">to fill the form from its description, and tick</w:t>
+      </w:r>
+      <w:r>
+        <w:t xml:space="preserve"> </w:t>
+      </w:r>
+      <w:r>
+        <w:rPr>
+          <w:b/>
+          <w:bCs/>
+        </w:rPr>
+        <w:t xml:space="preserve">Add my files to this dataset</w:t>
+      </w:r>
+      <w:r>
+        <w:t xml:space="preserve"> </w:t>
+      </w:r>
+      <w:r>
+        <w:t xml:space="preserve">to go on); if the name is new, that it will be created, with a warning if it is close to an existing name.</w:t>
       </w:r>
     </w:p>
     <w:p>
@@ -394,7 +426,49 @@
         <w:t xml:space="preserve">Find data</w:t>
       </w:r>
       <w:r>
-        <w:t xml:space="preserve">. To add or update files later, use the same form with the same strand, project and dataset name. Nothing already deposited is ever removed.</w:t>
+        <w:t xml:space="preserve">. To add or update files later, use the same form and choose the same dataset: the form shows what is there and asks you to confirm. A file with the same name replaces the stored copy (the earlier copy is kept by the storage, so nothing is lost); every other file stays as it was. Nothing already deposited is ever removed. During the upload each file is marked</w:t>
+      </w:r>
+      <w:r>
+        <w:t xml:space="preserve"> </w:t>
+      </w:r>
+      <w:r>
+        <w:rPr>
+          <w:b/>
+          <w:bCs/>
+        </w:rPr>
+        <w:t xml:space="preserve">added</w:t>
+      </w:r>
+      <w:r>
+        <w:t xml:space="preserve">,</w:t>
+      </w:r>
+      <w:r>
+        <w:t xml:space="preserve"> </w:t>
+      </w:r>
+      <w:r>
+        <w:rPr>
+          <w:b/>
+          <w:bCs/>
+        </w:rPr>
+        <w:t xml:space="preserve">updated</w:t>
+      </w:r>
+      <w:r>
+        <w:t xml:space="preserve"> </w:t>
+      </w:r>
+      <w:r>
+        <w:t xml:space="preserve">or</w:t>
+      </w:r>
+      <w:r>
+        <w:t xml:space="preserve"> </w:t>
+      </w:r>
+      <w:r>
+        <w:rPr>
+          <w:b/>
+          <w:bCs/>
+        </w:rPr>
+        <w:t xml:space="preserve">unchanged</w:t>
+      </w:r>
+      <w:r>
+        <w:t xml:space="preserve">, and the Deposited message says how many of each there were.</w:t>
       </w:r>
     </w:p>
     <w:bookmarkEnd w:id="23"/>

</xml_diff>

<commit_message>
docs: scope notes for depositors, stewards and operators; the vocabulary repo kit gains "Describe a term"
Kit: the "Add a term" form requires a scope note and takes other
spellings; a new "Describe a term" form (label change:describe) drives
`crsw-vocab describe`; apply_issue.py maps both; the README says what a
good scope note contains and that a describe changes no dataset.
Carrying this to the live repository is a pull request there, and its
workflow installs the tool from main, so `describe` must be pushed
first.

Elsewhere: the researcher guide's "what this covers"; the README's `?`
and alias at the subjects prompt and the describe command; the runbook's
embeddings paragraph (text_sha, embed_text_changed) and a bullet for an
edited note; finding-and-reuse §5; the handoff's status note with the
departures.

Co-Authored-By: Claude Fable 5.1 <noreply@anthropic.com>
</commit_message>
<xml_diff>
--- a/docs/how-to-deposit.docx
+++ b/docs/how-to-deposit.docx
@@ -157,7 +157,23 @@
         <w:t xml:space="preserve">Describe the dataset</w:t>
       </w:r>
       <w:r>
-        <w:t xml:space="preserve">. Each box has a note under it saying what goes there. The slip on the right shows where the files will land as you type. As you name the project and dataset, the form offers the names already in use, and a note under the dataset name tells you what will happen: if the dataset already exists, how many files it has and that yours will be added to it (press</w:t>
+        <w:t xml:space="preserve">. Each box has a note under it saying what goes there. Under Subjects,</w:t>
+      </w:r>
+      <w:r>
+        <w:t xml:space="preserve"> </w:t>
+      </w:r>
+      <w:r>
+        <w:rPr>
+          <w:b/>
+          <w:bCs/>
+        </w:rPr>
+        <w:t xml:space="preserve">what this covers</w:t>
+      </w:r>
+      <w:r>
+        <w:t xml:space="preserve"> </w:t>
+      </w:r>
+      <w:r>
+        <w:t xml:space="preserve">beneath a term opens its definition, so you can check a term before ticking it. The slip on the right shows where the files will land as you type. As you name the project and dataset, the form offers the names already in use, and a note under the dataset name tells you what will happen: if the dataset already exists, how many files it has and that yours will be added to it (press</w:t>
       </w:r>
       <w:r>
         <w:t xml:space="preserve"> </w:t>

</xml_diff>

<commit_message>
feat(web): places as pills beside temporal coverage; Origin is Derivation
Spatial coverage moves up to sit under the coverage years, where a
reader expects it, and is a type-ahead instead of a 278-row multi-select:
type a country or region, pick it from the list (label, what contains
it, code), and it becomes a pill with its code and a remove button; a
hidden input per pill posts `spatial` exactly as before, so the API,
validation and record are untouched. The places and their ancestor
labels ride in the page as JSON from `place_views` (built once per
places document). "Use its details" refills the pills.

The collapsed "Origin" section is now "Derivation", which is what it
holds; its id and class stay, so the script and styles are unchanged.
Researcher guide and its Word copy updated.

Co-Authored-By: Claude Fable 5.1 <noreply@anthropic.com>
Claude-Session: https://claude.ai/code/session_012xWm3umcf6daiqsbB2N1u2
</commit_message>
<xml_diff>
--- a/docs/how-to-deposit.docx
+++ b/docs/how-to-deposit.docx
@@ -212,10 +212,10 @@
           <w:b/>
           <w:bCs/>
         </w:rPr>
-        <w:t xml:space="preserve">Places covered</w:t>
-      </w:r>
-      <w:r>
-        <w:t xml:space="preserve">, choose the regions or countries the data covers; a region stands for every country inside it, so choose the broadest that fits. The slip on the right shows where the files will land as you type. As you name the project and dataset, the form offers the names already in use, and a note under the dataset name tells you what will happen: if the dataset already exists, how many files it has and that yours will be added to it (press</w:t>
+        <w:t xml:space="preserve">Spatial coverage</w:t>
+      </w:r>
+      <w:r>
+        <w:t xml:space="preserve">, next to the years, type a country or region and pick it from the list; it appears as a tag you can remove with its ×. A region stands for every country inside it, so choose the broadest that fits. The slip on the right shows where the files will land as you type. As you name the project and dataset, the form offers the names already in use, and a note under the dataset name tells you what will happen: if the dataset already exists, how many files it has and that yours will be added to it (press</w:t>
       </w:r>
       <w:r>
         <w:t xml:space="preserve"> </w:t>
@@ -269,7 +269,7 @@
           <w:b/>
           <w:bCs/>
         </w:rPr>
-        <w:t xml:space="preserve">Origin</w:t>
+        <w:t xml:space="preserve">Derivation</w:t>
       </w:r>
       <w:r>
         <w:t xml:space="preserve"> </w:t>
@@ -426,7 +426,7 @@
         <w:t xml:space="preserve">“armed conflict”</w:t>
       </w:r>
       <w:r>
-        <w:t xml:space="preserve">, and write a paragraph on what the extract holds. Under Origin they pick the original CSAC dataset from the store. They add</w:t>
+        <w:t xml:space="preserve">, and write a paragraph on what the extract holds. Under Derivation they pick the original CSAC dataset from the store. They add</w:t>
       </w:r>
       <w:r>
         <w:t xml:space="preserve"> </w:t>

</xml_diff>

<commit_message>
feat(web): provider picked the same way as places, as pills
The place picker becomes one pill picker used twice: spatial coverage
over the places, provider over the vocabulary's providers list (both
embedded in the page as JSON). Picking a provider fills the licence
from its rights statement and, for raw data, the creator from its
name, as the select did; "Provider not listed?" stays beside it. The
hidden inputs post `provider` as the list the API already took.

Co-Authored-By: Claude Fable 5.1 <noreply@anthropic.com>
Claude-Session: https://claude.ai/code/session_012xWm3umcf6daiqsbB2N1u2
</commit_message>
<xml_diff>
--- a/docs/how-to-deposit.docx
+++ b/docs/how-to-deposit.docx
@@ -173,7 +173,7 @@
         <w:t xml:space="preserve"> </w:t>
       </w:r>
       <w:r>
-        <w:t xml:space="preserve">beneath a term opens its definition, so you can check a term before ticking it. If the data comes from an outside provider (ACLED, the Traffik Analysis Hub and so on), choose it under</w:t>
+        <w:t xml:space="preserve">beneath a term opens its definition, so you can check a term before ticking it. If the data comes from an outside provider (ACLED, the Traffik Analysis Hub and so on), type its name under</w:t>
       </w:r>
       <w:r>
         <w:t xml:space="preserve"> </w:t>
@@ -186,7 +186,10 @@
         <w:t xml:space="preserve">Provider</w:t>
       </w:r>
       <w:r>
-        <w:t xml:space="preserve">: the licence, and for data as received the creator, are filled from the provider’s entry, and you can edit them. If the provider is not listed, name it in</w:t>
+        <w:t xml:space="preserve"> </w:t>
+      </w:r>
+      <w:r>
+        <w:t xml:space="preserve">and pick it; it appears as a tag, and the licence, and for data as received the creator, are filled from the provider’s entry, which you can edit. If the provider is not listed, name it in</w:t>
       </w:r>
       <w:r>
         <w:t xml:space="preserve"> </w:t>

</xml_diff>

<commit_message>
docs: two finding pages, Find data and Search by meaning or content
The researcher guide (and its Word copy), finding-and-reuse.md §5 (a
dated line on why the question-to-filter step was retired and where
meaning search over descriptions now lives), the runbook's platform
section and its "Ranking ... is off" entries, the README and CLAUDE.md
follow the code.

Co-Authored-By: Claude Fable 5.1 <noreply@anthropic.com>
Claude-Session: https://claude.ai/code/session_012xWm3umcf6daiqsbB2N1u2
</commit_message>
<xml_diff>
--- a/docs/how-to-deposit.docx
+++ b/docs/how-to-deposit.docx
@@ -595,16 +595,7 @@
         <w:t xml:space="preserve"> </w:t>
       </w:r>
       <w:r>
-        <w:t xml:space="preserve">at the foot of the list changes that, and the page remembers your choice. Search by a word from the name or description, or filter by strand, subject or whether the data is green or amber; the projects that match open by themselves. Where the Centre has switched it on, you can also type a question in your own words, such as</w:t>
-      </w:r>
-      <w:r>
-        <w:t xml:space="preserve"> </w:t>
-      </w:r>
-      <w:r>
-        <w:t xml:space="preserve">“anything on deaths in armed conflicts since 1990”</w:t>
-      </w:r>
-      <w:r>
-        <w:t xml:space="preserve">: the page shows how it understood you, fills in the filters to match, and puts the closest datasets first. Your question and the descriptions of likely matches are read by KCL’s own AI service. Where</w:t>
+        <w:t xml:space="preserve">at the foot of the list changes that, and the page remembers your choice. Search by a word from the name or description, or filter by strand, subject, place or whether the data is green or amber; the projects that match open by themselves. Where</w:t>
       </w:r>
       <w:r>
         <w:t xml:space="preserve"> </w:t>
@@ -614,13 +605,25 @@
           <w:b/>
           <w:bCs/>
         </w:rPr>
-        <w:t xml:space="preserve">Search inside content</w:t>
-      </w:r>
-      <w:r>
-        <w:t xml:space="preserve"> </w:t>
-      </w:r>
-      <w:r>
-        <w:t xml:space="preserve">appears in the top bar, you can also search what the documents themselves say: type a phrase or a question and you get the passages that come closest, each with its dataset, its file and, for PDFs, its page, with the sentence nearest to your question marked and your own words in bold. You only ever see passages from files you would be allowed to download. Open a dataset to read its description, see what it was made from and what has been made from it, and download any file. A large download that is interrupted can be resumed. Amber data is listed for everyone; whether you can download it depends on the Centre’s rule, and the page tells you who to ask.</w:t>
+        <w:t xml:space="preserve">Search by meaning or content</w:t>
+      </w:r>
+      <w:r>
+        <w:t xml:space="preserve"> </w:t>
+      </w:r>
+      <w:r>
+        <w:t xml:space="preserve">appears in the top bar, you can also search by what a dataset is about or what its documents say: type a phrase or a question in your own words and you get, first, the datasets whose descriptions come closest, then the passages from inside their documents that come closest, each with its dataset, its file and, for PDFs, its page. In each the sentence nearest to your question is marked and your own words are in bold, and</w:t>
+      </w:r>
+      <w:r>
+        <w:t xml:space="preserve"> </w:t>
+      </w:r>
+      <w:r>
+        <w:t xml:space="preserve">“Why this?”</w:t>
+      </w:r>
+      <w:r>
+        <w:t xml:space="preserve"> </w:t>
+      </w:r>
+      <w:r>
+        <w:t xml:space="preserve">asks for one sentence on the connection. Your words, the descriptions and those passages are read by KCL’s own AI service. You only ever see passages from files you would be allowed to download, and a dataset whose description has not yet been read that way is still found on Find data by its words. Open a dataset to read its description, see what it was made from and what has been made from it, and download any file. A large download that is interrupted can be resumed. Amber data is listed for everyone; whether you can download it depends on the Centre’s rule, and the page tells you who to ask.</w:t>
       </w:r>
     </w:p>
     <w:bookmarkEnd w:id="24"/>

</xml_diff>